<commit_message>
verify fb-595.54.54 generated engines
</commit_message>
<xml_diff>
--- a/courts/tenth-circuit/new-mexico/state/court-of-appeals/amicus-brief/usage/OUTPUT-amicus-brief.docx
+++ b/courts/tenth-circuit/new-mexico/state/court-of-appeals/amicus-brief/usage/OUTPUT-amicus-brief.docx
@@ -2615,7 +2615,7 @@
         <w:tab/>
       </w:r>
       <w:r>
-        <w:t xml:space="preserve">16</w:t>
+        <w:t xml:space="preserve">17</w:t>
       </w:r>
     </w:p>
     <w:p>
@@ -2953,7 +2953,7 @@
         <w:tab/>
       </w:r>
       <w:r>
-        <w:t xml:space="preserve">27</w:t>
+        <w:t xml:space="preserve">28</w:t>
       </w:r>
     </w:p>
     <w:p>
@@ -9560,7 +9560,7 @@
         <w:t xml:space="preserve"> </w:t>
       </w:r>
       <w:r>
-        <w:t xml:space="preserve">Office of the New Mexico State Engineer, Middle Rio Grande Administrative Area Guidelines for Review of Water Right Applications (2000), http://www.ose.state.nm.us/​doing–business/​mrgbasin/​crit9–13.pdf.</w:t>
+        <w:t xml:space="preserve">Office of the New Mexico State Engineer, Middle Rio Grande Administrative Area Guidelines for Review of Water Right Applications (2000), http://​​www.​ose.​state.​nm.​us/​​doing–business/​​mrgbasin/​​crit9–13.​pdf.</w:t>
       </w:r>
     </w:p>
   </w:footnote>
@@ -9579,13 +9579,13 @@
         <w:t xml:space="preserve"> </w:t>
       </w:r>
       <w:r>
-        <w:t xml:space="preserve">New Mexico’s 50 Year Water Action Plan’s opening statement from Governor Michelle Lujan Grisham reads: “There are few places in the world where water holds such profound significance as here in New Mexico. The original inhabitants of the southwest have recognized the life-sustaining import of water for thousands of years. Today, it also holds immeasurable cultural, agricultural, ecological, economic, and recreational value.” Office of the Governor Michelle Lujan Grisham, 50 Year Water Action Plan, p. i (2024), available at https://www.nm.gov/​wp-content/​uploads/2024/01/​New-Mexico</w:t>
-      </w:r>
-      <w:r>
-        <w:noBreakHyphen/>
-      </w:r>
-      <w:r>
-        <w:t xml:space="preserve">50-Year-WaterAction-Plan.pdf.</w:t>
+        <w:t xml:space="preserve">New Mexico’s 50 Year Water Action Plan’s opening statement from Governor Michelle Lujan Grisham reads: “There are few places in the world where water holds such profound significance as here in New Mexico. The original inhabitants of the southwest have recognized the life-sustaining import of water for thousands of years. Today, it also holds immeasurable cultural, agricultural, ecological, economic, and recreational value.” Office of the Governor Michelle Lujan Grisham, 50 Year Water Action Plan, p. i (2024), available at https://​​www.​nm.​gov/​​wp-​content/​​uploads/​​2024/​​01/​​New-​Mexico</w:t>
+      </w:r>
+      <w:r>
+        <w:noBreakHyphen/>
+      </w:r>
+      <w:r>
+        <w:t xml:space="preserve">50-​Year-​WaterAction-​Plan.​pdf.</w:t>
       </w:r>
     </w:p>
   </w:footnote>
@@ -10384,6 +10384,7 @@
     <w:unhideWhenUsed/>
     <w:qFormat/>
     <w:pPr>
+      <w:keepLines/>
       <w:spacing w:before="0" w:after="140" w:line="322" w:lineRule="exact"/>
     </w:pPr>
     <w:rPr>

</xml_diff>

<commit_message>
nmctapp amicus-brief: regenerate on the model at HEAD; the footnote URL breaks alike, docx gated (XENG pass), latex reported (the § token \mbox drops footnote 4; pass-1 latex render kept) (fb-595.54.54)
Co-Authored-By: Claude Opus 5.5 <noreply@anthropic.com>
</commit_message>
<xml_diff>
--- a/courts/tenth-circuit/new-mexico/state/court-of-appeals/amicus-brief/usage/OUTPUT-amicus-brief.docx
+++ b/courts/tenth-circuit/new-mexico/state/court-of-appeals/amicus-brief/usage/OUTPUT-amicus-brief.docx
@@ -3192,7 +3192,7 @@
         <w:pStyle w:val="XdQuoteOnly"/>
       </w:pPr>
       <w:r>
-        <w:t xml:space="preserve">few public interests are more obvious, indisputable, and independent of particular theory than the interest of the public of a state to maintain the rivers that are wholly within it substantially undiminished, except by such drafts upon them as the guardian of the public welfare may permit for the purpose of turning them to a more perfect use. This public interest is omnipresent wherever there is a state, and grows more pressing as population grows. . .. The private right to appropriate is subject not only to the rights of lower owners, but to the initial limitation that it may not substantially diminish one of the great foundations of public welfare and health.</w:t>
+        <w:t xml:space="preserve">few public interests are more obvious, indisputable, and independent of particular theory than the interest of the public of a state to maintain the rivers that are wholly within it substantially undiminished, except by such drafts upon them as the guardian of the public welfare may permit for the purpose of turning them to a more perfect use. This public interest is omnipresent wherever there is a state, and grows more pressing as population grows. . .. The private right to appropriate is subject not only to the rights of lower owners, but to the initial limitation that it may not substantially diminish one of the great foundations of public welfare and health.</w:t>
       </w:r>
     </w:p>
     <w:p>
@@ -3547,40 +3547,16 @@
         <w:pStyle w:val="BodyText"/>
       </w:pPr>
       <w:r>
-        <w:t xml:space="preserve">New Mexico’s water code makes the Office of the State Engineer (“OSE”) responsible for the management and administration of water resources throughout the state. See NMSA 1978, §§ 72</w:t>
-      </w:r>
-      <w:r>
-        <w:noBreakHyphen/>
-      </w:r>
-      <w:r>
-        <w:t xml:space="preserve">2</w:t>
-      </w:r>
-      <w:r>
-        <w:noBreakHyphen/>
-      </w:r>
-      <w:r>
-        <w:t xml:space="preserve">1 to</w:t>
-      </w:r>
-      <w:r>
-        <w:t xml:space="preserve"> </w:t>
-      </w:r>
-      <w:r>
-        <w:noBreakHyphen/>
-      </w:r>
-      <w:r>
-        <w:t xml:space="preserve">20 (1907, as amended through 2019); id. § 72</w:t>
-      </w:r>
-      <w:r>
-        <w:noBreakHyphen/>
-      </w:r>
-      <w:r>
-        <w:t xml:space="preserve">2</w:t>
-      </w:r>
-      <w:r>
-        <w:noBreakHyphen/>
-      </w:r>
-      <w:r>
-        <w:t xml:space="preserve">1 (providing that the OSE “has general supervision of waters of the state and of the measurement, appropriation, distribution thereof and such other duties as required”). The Supreme Court has recognized that the Office of the State Engineer has a fundamental duty and mandatory obligation to implement and administer the allocation of water rights in New Mexico, subject to judicial appeal. See</w:t>
+        <w:t xml:space="preserve">New Mexico’s water code makes the Office of the State Engineer (“OSE”) responsible for the management and administration of water resources throughout the state. See NMSA 1978, §§ 72-⁠2-⁠1 to</w:t>
+      </w:r>
+      <w:r>
+        <w:t xml:space="preserve"> </w:t>
+      </w:r>
+      <w:r>
+        <w:noBreakHyphen/>
+      </w:r>
+      <w:r>
+        <w:t xml:space="preserve">20 (1907, as amended through 2019); id. § 72-⁠2-⁠1 (providing that the OSE “has general supervision of waters of the state and of the measurement, appropriation, distribution thereof and such other duties as required”). The Supreme Court has recognized that the Office of the State Engineer has a fundamental duty and mandatory obligation to implement and administer the allocation of water rights in New Mexico, subject to judicial appeal. See</w:t>
       </w:r>
       <w:r>
         <w:t xml:space="preserve"> </w:t>
@@ -3619,19 +3595,7 @@
         <w:noBreakHyphen/>
       </w:r>
       <w:r>
-        <w:t xml:space="preserve">29, COA 3] [RP 7785] This permit condition tracks the language of the statute that governs the water rights transfers in this case, NMSA 1978, § 72</w:t>
-      </w:r>
-      <w:r>
-        <w:noBreakHyphen/>
-      </w:r>
-      <w:r>
-        <w:t xml:space="preserve">5</w:t>
-      </w:r>
-      <w:r>
-        <w:noBreakHyphen/>
-      </w:r>
-      <w:r>
-        <w:t xml:space="preserve">23 (1907, as amended through 1985), which provides in relevant part that a transfer may be allowed if the transfer can be made “without losing priority of right theretofore established, if such changes can be made without detriment to existing water rights and are not contrary to conservation of water within the state and not detrimental to the public welfare of the state.” Thus, the OSE has an obligation under both New Mexico law and the terms of the 2003 permit to ensure that the City’s transfer of water rights is accomplished without impairing existing water rights or causing detriment to the public welfare of New Mexico.</w:t>
+        <w:t xml:space="preserve">29, COA 3] [RP 7785] This permit condition tracks the language of the statute that governs the water rights transfers in this case, NMSA 1978, § 72-⁠5-⁠23 (1907, as amended through 1985), which provides in relevant part that a transfer may be allowed if the transfer can be made “without losing priority of right theretofore established, if such changes can be made without detriment to existing water rights and are not contrary to conservation of water within the state and not detrimental to the public welfare of the state.” Thus, the OSE has an obligation under both New Mexico law and the terms of the 2003 permit to ensure that the City’s transfer of water rights is accomplished without impairing existing water rights or causing detriment to the public welfare of New Mexico.</w:t>
       </w:r>
     </w:p>
     <w:p>
@@ -3670,13 +3634,7 @@
         <w:noBreakHyphen/>
       </w:r>
       <w:r>
-        <w:t xml:space="preserve">002, ¶¶ 14</w:t>
-      </w:r>
-      <w:r>
-        <w:noBreakHyphen/>
-      </w:r>
-      <w:r>
-        <w:t xml:space="preserve">15, 141 N.M. 21, 150 P.3d 971.</w:t>
+        <w:t xml:space="preserve">002, ¶¶ 14-⁠15, 141 N.M. 21, 150 P.3d 971.</w:t>
       </w:r>
     </w:p>
     <w:p>
@@ -3923,7 +3881,7 @@
         <w:pStyle w:val="BodyText"/>
       </w:pPr>
       <w:r>
-        <w:t xml:space="preserve">Appeals of decisions of the OSE under NMSA 1978, § 72</w:t>
+        <w:t xml:space="preserve">Appeals of decisions of the OSE under NMSA 1978, § 72-⁠7-⁠1 differ from other administrative appeals in New Mexico. Under Section 72</w:t>
       </w:r>
       <w:r>
         <w:noBreakHyphen/>
@@ -3935,7 +3893,47 @@
         <w:noBreakHyphen/>
       </w:r>
       <w:r>
-        <w:t xml:space="preserve">1 differ from other administrative appeals in New Mexico. Under Section 72</w:t>
+        <w:t xml:space="preserve">1, the district court conducts de novo proceedings “as cases originally docketed in the district court.” N.M. Const. Art. XVI, § 5. This standard permits the district court to consider both evidence presented to the OSE and additional evidence not before the agency. See NMSA 1978, § 72-⁠7-⁠1(E) (“The proceeding upon appeal shall be de novo as cases originally docketed in the district court. Evidence taken in a hearing before the state engineer may be considered as original evidence subject to legal objection, the same as if the evidence was originally offered in the district court.”);</w:t>
+      </w:r>
+      <w:r>
+        <w:t xml:space="preserve"> </w:t>
+      </w:r>
+      <w:r>
+        <w:rPr>
+          <w:i/>
+          <w:iCs/>
+        </w:rPr>
+        <w:t xml:space="preserve">Lion’s Gate Water</w:t>
+      </w:r>
+      <w:r>
+        <w:t xml:space="preserve">, 2009-NMSC</w:t>
+      </w:r>
+      <w:r>
+        <w:noBreakHyphen/>
+      </w:r>
+      <w:r>
+        <w:t xml:space="preserve">057, ¶ 22 (“[N]o limitations have been placed by law upon the power of our district courts in these appeals to find facts, make conclusions of law and enter such judgments, orders and decrees as are proper to dispose of the issues.” (citation omitted)).</w:t>
+      </w:r>
+    </w:p>
+    <w:p>
+      <w:pPr>
+        <w:pStyle w:val="BodyText"/>
+      </w:pPr>
+      <w:r>
+        <w:t xml:space="preserve">In</w:t>
+      </w:r>
+      <w:r>
+        <w:t xml:space="preserve"> </w:t>
+      </w:r>
+      <w:r>
+        <w:rPr>
+          <w:i/>
+          <w:iCs/>
+        </w:rPr>
+        <w:t xml:space="preserve">Lion’s Gate</w:t>
+      </w:r>
+      <w:r>
+        <w:t xml:space="preserve">, the Supreme Court clarified that a district court’s de novo proceedings under Section 72</w:t>
       </w:r>
       <w:r>
         <w:noBreakHyphen/>
@@ -3947,38 +3945,23 @@
         <w:noBreakHyphen/>
       </w:r>
       <w:r>
-        <w:t xml:space="preserve">1, the district court conducts de novo proceedings “as cases originally docketed in the district court.” N.M. Const. Art. XVI, § 5. This standard permits the district court to consider both evidence presented to the OSE and additional evidence not before the agency. See NMSA 1978, § 72</w:t>
-      </w:r>
-      <w:r>
-        <w:noBreakHyphen/>
-      </w:r>
-      <w:r>
-        <w:t xml:space="preserve">7</w:t>
-      </w:r>
-      <w:r>
-        <w:noBreakHyphen/>
-      </w:r>
-      <w:r>
-        <w:t xml:space="preserve">1(E) (“The proceeding upon appeal shall be de novo as cases originally docketed in the district court. Evidence taken in a hearing before the state engineer may be considered as original evidence subject to legal objection, the same as if the evidence was originally offered in the district court.”);</w:t>
-      </w:r>
-      <w:r>
-        <w:t xml:space="preserve"> </w:t>
-      </w:r>
-      <w:r>
-        <w:rPr>
-          <w:i/>
-          <w:iCs/>
-        </w:rPr>
-        <w:t xml:space="preserve">Lion’s Gate Water</w:t>
-      </w:r>
-      <w:r>
-        <w:t xml:space="preserve">, 2009-NMSC</w:t>
-      </w:r>
-      <w:r>
-        <w:noBreakHyphen/>
-      </w:r>
-      <w:r>
-        <w:t xml:space="preserve">057, ¶ 22 (“[N]o limitations have been placed by law upon the power of our district courts in these appeals to find facts, make conclusions of law and enter such judgments, orders and decrees as are proper to dispose of the issues.” (citation omitted)).</w:t>
+        <w:t xml:space="preserve">1 must be limited to the issues considered by the OSE.</w:t>
+      </w:r>
+      <w:r>
+        <w:t xml:space="preserve"> </w:t>
+      </w:r>
+      <w:r>
+        <w:rPr>
+          <w:i/>
+          <w:iCs/>
+        </w:rPr>
+        <w:t xml:space="preserve">Id.</w:t>
+      </w:r>
+      <w:r>
+        <w:t xml:space="preserve"> </w:t>
+      </w:r>
+      <w:r>
+        <w:t xml:space="preserve">This appellate structure permits the district court to benefit from the OSE’s specialized expertise in administering water rights and priorities while also considering additional facts and evidence, including information that may fall outside the scope of the OSE’s direct expertise, such as water quality considerations or water rights arising under federal law.</w:t>
       </w:r>
     </w:p>
     <w:p>
@@ -3986,48 +3969,66 @@
         <w:pStyle w:val="BodyText"/>
       </w:pPr>
       <w:r>
-        <w:t xml:space="preserve">In</w:t>
-      </w:r>
-      <w:r>
-        <w:t xml:space="preserve"> </w:t>
-      </w:r>
-      <w:r>
-        <w:rPr>
-          <w:i/>
-          <w:iCs/>
-        </w:rPr>
-        <w:t xml:space="preserve">Lion’s Gate</w:t>
-      </w:r>
-      <w:r>
-        <w:t xml:space="preserve">, the Supreme Court clarified that a district court’s de novo proceedings under Section 72</w:t>
-      </w:r>
-      <w:r>
-        <w:noBreakHyphen/>
-      </w:r>
-      <w:r>
-        <w:t xml:space="preserve">7</w:t>
-      </w:r>
-      <w:r>
-        <w:noBreakHyphen/>
-      </w:r>
-      <w:r>
-        <w:t xml:space="preserve">1 must be limited to the issues considered by the OSE.</w:t>
-      </w:r>
-      <w:r>
-        <w:t xml:space="preserve"> </w:t>
-      </w:r>
-      <w:r>
-        <w:rPr>
-          <w:i/>
-          <w:iCs/>
-        </w:rPr>
-        <w:t xml:space="preserve">Id.</w:t>
-      </w:r>
-      <w:r>
-        <w:t xml:space="preserve"> </w:t>
-      </w:r>
-      <w:r>
-        <w:t xml:space="preserve">This appellate structure permits the district court to benefit from the OSE’s specialized expertise in administering water rights and priorities while also considering additional facts and evidence, including information that may fall outside the scope of the OSE’s direct expertise, such as water quality considerations or water rights arising under federal law.</w:t>
+        <w:t xml:space="preserve">In this case, the issue before the OSE was whether the City’s transfer applications should be approved under Sections 72</w:t>
+      </w:r>
+      <w:r>
+        <w:noBreakHyphen/>
+      </w:r>
+      <w:r>
+        <w:t xml:space="preserve">5</w:t>
+      </w:r>
+      <w:r>
+        <w:noBreakHyphen/>
+      </w:r>
+      <w:r>
+        <w:t xml:space="preserve">23 and</w:t>
+      </w:r>
+      <w:r>
+        <w:t xml:space="preserve"> </w:t>
+      </w:r>
+      <w:r>
+        <w:noBreakHyphen/>
+      </w:r>
+      <w:r>
+        <w:t xml:space="preserve">24. In considering this issue, the OSE failed to consider specific factors relevant to evaluating impairment of rights and public welfare. [RP 7787] The OSE declined to consider Sandia’s instream beneficial use, even though it is established in New Mexico that such uses must be considered by the OSE when evaluating a transfer application. See</w:t>
+      </w:r>
+      <w:r>
+        <w:t xml:space="preserve"> </w:t>
+      </w:r>
+      <w:r>
+        <w:rPr>
+          <w:i/>
+          <w:iCs/>
+        </w:rPr>
+        <w:t xml:space="preserve">Carangelo v. Albuquerque-Bernalillo Cnty. Water Util. Auth.</w:t>
+      </w:r>
+      <w:r>
+        <w:t xml:space="preserve">, 2014-NMCA</w:t>
+      </w:r>
+      <w:r>
+        <w:noBreakHyphen/>
+      </w:r>
+      <w:r>
+        <w:t xml:space="preserve">032, ¶ 28, 320 P.3d 492. And the OSE failed to consider water quality impacts, even though both the OSE and the courts have considered water quality in previous cases. See</w:t>
+      </w:r>
+      <w:r>
+        <w:t xml:space="preserve"> </w:t>
+      </w:r>
+      <w:r>
+        <w:rPr>
+          <w:i/>
+          <w:iCs/>
+        </w:rPr>
+        <w:t xml:space="preserve">Heine v. Reynolds</w:t>
+      </w:r>
+      <w:r>
+        <w:t xml:space="preserve">, 1962-NMSC</w:t>
+      </w:r>
+      <w:r>
+        <w:noBreakHyphen/>
+      </w:r>
+      <w:r>
+        <w:t xml:space="preserve">002, ¶ 9, 69 N.M. 398, 367 P.2d 708 (upholding the district court’s denial of an application on the ground that increased pumping would gradually increase salt content in the Roswell Artesian Basin, thereby impairing water quality and existing rights).</w:t>
       </w:r>
     </w:p>
     <w:p>
@@ -4035,86 +4036,7 @@
         <w:pStyle w:val="BodyText"/>
       </w:pPr>
       <w:r>
-        <w:t xml:space="preserve">In this case, the issue before the OSE was whether the City’s transfer applications should be approved under Sections 72</w:t>
-      </w:r>
-      <w:r>
-        <w:noBreakHyphen/>
-      </w:r>
-      <w:r>
-        <w:t xml:space="preserve">5</w:t>
-      </w:r>
-      <w:r>
-        <w:noBreakHyphen/>
-      </w:r>
-      <w:r>
-        <w:t xml:space="preserve">23 and</w:t>
-      </w:r>
-      <w:r>
-        <w:t xml:space="preserve"> </w:t>
-      </w:r>
-      <w:r>
-        <w:noBreakHyphen/>
-      </w:r>
-      <w:r>
-        <w:t xml:space="preserve">24. In considering this issue, the OSE failed to consider specific factors relevant to evaluating impairment of rights and public welfare. [RP 7787] The OSE declined to consider Sandia’s instream beneficial use, even though it is established in New Mexico that such uses must be considered by the OSE when evaluating a transfer application. See</w:t>
-      </w:r>
-      <w:r>
-        <w:t xml:space="preserve"> </w:t>
-      </w:r>
-      <w:r>
-        <w:rPr>
-          <w:i/>
-          <w:iCs/>
-        </w:rPr>
-        <w:t xml:space="preserve">Carangelo v. Albuquerque-Bernalillo Cnty. Water Util. Auth.</w:t>
-      </w:r>
-      <w:r>
-        <w:t xml:space="preserve">, 2014-NMCA</w:t>
-      </w:r>
-      <w:r>
-        <w:noBreakHyphen/>
-      </w:r>
-      <w:r>
-        <w:t xml:space="preserve">032, ¶ 28, 320 P.3d 492. And the OSE failed to consider water quality impacts, even though both the OSE and the courts have considered water quality in previous cases. See</w:t>
-      </w:r>
-      <w:r>
-        <w:t xml:space="preserve"> </w:t>
-      </w:r>
-      <w:r>
-        <w:rPr>
-          <w:i/>
-          <w:iCs/>
-        </w:rPr>
-        <w:t xml:space="preserve">Heine v. Reynolds</w:t>
-      </w:r>
-      <w:r>
-        <w:t xml:space="preserve">, 1962-NMSC</w:t>
-      </w:r>
-      <w:r>
-        <w:noBreakHyphen/>
-      </w:r>
-      <w:r>
-        <w:t xml:space="preserve">002, ¶ 9, 69 N.M. 398, 367 P.2d 708 (upholding the district court’s denial of an application on the ground that increased pumping would gradually increase salt content in the Roswell Artesian Basin, thereby impairing water quality and existing rights).</w:t>
-      </w:r>
-    </w:p>
-    <w:p>
-      <w:pPr>
-        <w:pStyle w:val="BodyText"/>
-      </w:pPr>
-      <w:r>
-        <w:t xml:space="preserve">The district court exercised appropriate appellate review under the applicable legal framework by considering the issue considered by the OSE, while allowing additional evidence relevant to the statutory criteria. NMSA 1978, § 72</w:t>
-      </w:r>
-      <w:r>
-        <w:noBreakHyphen/>
-      </w:r>
-      <w:r>
-        <w:t xml:space="preserve">7</w:t>
-      </w:r>
-      <w:r>
-        <w:noBreakHyphen/>
-      </w:r>
-      <w:r>
-        <w:t xml:space="preserve">1(E). The district court properly reversed the OSE because the City failed to show the transfers would not impair the Pueblo’s time immemorial water rights involving instream uses of the Rio Grande, and because the City failed to show that the transfers would not be a detriment to public welfare. [RP 7795</w:t>
+        <w:t xml:space="preserve">The district court exercised appropriate appellate review under the applicable legal framework by considering the issue considered by the OSE, while allowing additional evidence relevant to the statutory criteria. NMSA 1978, § 72-⁠7-⁠1(E). The district court properly reversed the OSE because the City failed to show the transfers would not impair the Pueblo’s time immemorial water rights involving instream uses of the Rio Grande, and because the City failed to show that the transfers would not be a detriment to public welfare. [RP 7795</w:t>
       </w:r>
       <w:r>
         <w:noBreakHyphen/>
@@ -5016,19 +4938,7 @@
         <w:t xml:space="preserve"> </w:t>
       </w:r>
       <w:r>
-        <w:t xml:space="preserve">the use of any waters in this state for any useful or beneficial purpose are hereby recognized and confirmed.”); N.M. Const. Art. XVI, § 2 (“The unappropriated water of every natural stream, perennial or torrential, within the state of New Mexico, is hereby declared to belong to the public[.]”); see also NMSA 1978, § 72</w:t>
-      </w:r>
-      <w:r>
-        <w:noBreakHyphen/>
-      </w:r>
-      <w:r>
-        <w:t xml:space="preserve">1</w:t>
-      </w:r>
-      <w:r>
-        <w:noBreakHyphen/>
-      </w:r>
-      <w:r>
-        <w:t xml:space="preserve">1 (“All natural waters flowing in streams and watercourses, whether such be perennial, or torrential, within the limits of the state of New Mexico, belong to the public and are subject to appropriation for beneficial use.”).</w:t>
+        <w:t xml:space="preserve">the use of any waters in this state for any useful or beneficial purpose are hereby recognized and confirmed.”); N.M. Const. Art. XVI, § 2 (“The unappropriated water of every natural stream, perennial or torrential, within the state of New Mexico, is hereby declared to belong to the public[.]”); see also NMSA 1978, § 72-⁠1-⁠1 (“All natural waters flowing in streams and watercourses, whether such be perennial, or torrential, within the limits of the state of New Mexico, belong to the public and are subject to appropriation for beneficial use.”).</w:t>
       </w:r>
     </w:p>
     <w:p>
@@ -5114,19 +5024,7 @@
         <w:t xml:space="preserve">Id.</w:t>
       </w:r>
       <w:r>
-        <w:t xml:space="preserve">; see NMSA 1978, § 72</w:t>
-      </w:r>
-      <w:r>
-        <w:noBreakHyphen/>
-      </w:r>
-      <w:r>
-        <w:t xml:space="preserve">1</w:t>
-      </w:r>
-      <w:r>
-        <w:noBreakHyphen/>
-      </w:r>
-      <w:r>
-        <w:t xml:space="preserve">2 (1907). The doctrine of beneficial use applies to both consumptive and non-consumptive water uses.</w:t>
+        <w:t xml:space="preserve">; see NMSA 1978, § 72-⁠1-⁠2 (1907). The doctrine of beneficial use applies to both consumptive and non-consumptive water uses.</w:t>
       </w:r>
       <w:r>
         <w:t xml:space="preserve"> </w:t>
@@ -5153,19 +5051,7 @@
         <w:pStyle w:val="BodyText"/>
       </w:pPr>
       <w:r>
-        <w:t xml:space="preserve">As noted above, the New Mexico Constitution protects existing water uses through priority administration. N.M. Const. Art. XVI, § 2 (“Priority of appropriation shall give the better right.”); § 72</w:t>
-      </w:r>
-      <w:r>
-        <w:noBreakHyphen/>
-      </w:r>
-      <w:r>
-        <w:t xml:space="preserve">1</w:t>
-      </w:r>
-      <w:r>
-        <w:noBreakHyphen/>
-      </w:r>
-      <w:r>
-        <w:t xml:space="preserve">2 (“Priority in time shall give the better right.”). Under this doctrine, “[t]he appropriation of water for beneficial use establishes the priority date of a water right in relation to other water rights, and the full right of an earlier appropriator will be protected, to the extent of that appropriator’s use, against a later appropriator.”</w:t>
+        <w:t xml:space="preserve">As noted above, the New Mexico Constitution protects existing water uses through priority administration. N.M. Const. Art. XVI, § 2 (“Priority of appropriation shall give the better right.”); § 72-⁠1-⁠2 (“Priority in time shall give the better right.”). Under this doctrine, “[t]he appropriation of water for beneficial use establishes the priority date of a water right in relation to other water rights, and the full right of an earlier appropriator will be protected, to the extent of that appropriator’s use, against a later appropriator.”</w:t>
       </w:r>
       <w:r>
         <w:t xml:space="preserve"> </w:t>
@@ -5192,19 +5078,7 @@
         <w:pStyle w:val="BodyText"/>
       </w:pPr>
       <w:r>
-        <w:t xml:space="preserve">The prior appropriation doctrine gives Pueblo water rights that have been in use from time immemorial priority over later uses. See § 72</w:t>
-      </w:r>
-      <w:r>
-        <w:noBreakHyphen/>
-      </w:r>
-      <w:r>
-        <w:t xml:space="preserve">1</w:t>
-      </w:r>
-      <w:r>
-        <w:noBreakHyphen/>
-      </w:r>
-      <w:r>
-        <w:t xml:space="preserve">2; see, e.g.,</w:t>
+        <w:t xml:space="preserve">The prior appropriation doctrine gives Pueblo water rights that have been in use from time immemorial priority over later uses. See § 72-⁠1-⁠2; see, e.g.,</w:t>
       </w:r>
       <w:r>
         <w:t xml:space="preserve"> </w:t>
@@ -5249,19 +5123,7 @@
         <w:t xml:space="preserve">U.S. v. Winans</w:t>
       </w:r>
       <w:r>
-        <w:t xml:space="preserve">, 198 U.S. 371, 384 (1905). Like other water rights, aboriginal water rights do not need to be adjudicated to receive priority administration under New Mexico law. See NMSA 1978, § 72</w:t>
-      </w:r>
-      <w:r>
-        <w:noBreakHyphen/>
-      </w:r>
-      <w:r>
-        <w:t xml:space="preserve">2</w:t>
-      </w:r>
-      <w:r>
-        <w:noBreakHyphen/>
-      </w:r>
-      <w:r>
-        <w:t xml:space="preserve">9.1 (2003) (directing the state engineer to implement priority administration prior to formal adjudication of water rights because “the adjudication process is slow” and “the need for water administration is urgent”).</w:t>
+        <w:t xml:space="preserve">, 198 U.S. 371, 384 (1905). Like other water rights, aboriginal water rights do not need to be adjudicated to receive priority administration under New Mexico law. See NMSA 1978, § 72-⁠2-⁠9.1 (2003) (directing the state engineer to implement priority administration prior to formal adjudication of water rights because “the adjudication process is slow” and “the need for water administration is urgent”).</w:t>
       </w:r>
     </w:p>
     <w:p>
@@ -5281,19 +5143,7 @@
         <w:t xml:space="preserve"> </w:t>
       </w:r>
       <w:r>
-        <w:t xml:space="preserve">Prior to 1985, New Mexico law authorized the OSE to reject an application for a new appropriation of surface water if the appropriation would be “contrary to the public interest.” NMSA 1978, § 72</w:t>
-      </w:r>
-      <w:r>
-        <w:noBreakHyphen/>
-      </w:r>
-      <w:r>
-        <w:t xml:space="preserve">5</w:t>
-      </w:r>
-      <w:r>
-        <w:noBreakHyphen/>
-      </w:r>
-      <w:r>
-        <w:t xml:space="preserve">7 (1907, prior to 1985 amendment).</w:t>
+        <w:t xml:space="preserve">Prior to 1985, New Mexico law authorized the OSE to reject an application for a new appropriation of surface water if the appropriation would be “contrary to the public interest.” NMSA 1978, § 72-⁠5-⁠7 (1907, prior to 1985 amendment).</w:t>
       </w:r>
     </w:p>
     <w:p>
@@ -5301,31 +5151,7 @@
         <w:pStyle w:val="BodyText"/>
       </w:pPr>
       <w:r>
-        <w:t xml:space="preserve">Later, in 1985, the Legislature amended several statutes within the water code to authorize the OSE to deny an application if approval “would be contrary to the conservation of water within the state or detrimental to the public welfare of the state.” These provisions were added to multiple statutes, including the appropriation statute, § 72</w:t>
-      </w:r>
-      <w:r>
-        <w:noBreakHyphen/>
-      </w:r>
-      <w:r>
-        <w:t xml:space="preserve">5</w:t>
-      </w:r>
-      <w:r>
-        <w:noBreakHyphen/>
-      </w:r>
-      <w:r>
-        <w:t xml:space="preserve">7, and the transfer statute at issue in this case, § 72</w:t>
-      </w:r>
-      <w:r>
-        <w:noBreakHyphen/>
-      </w:r>
-      <w:r>
-        <w:t xml:space="preserve">5</w:t>
-      </w:r>
-      <w:r>
-        <w:noBreakHyphen/>
-      </w:r>
-      <w:r>
-        <w:t xml:space="preserve">23. The Legislature adopted the amendment to Section 72</w:t>
+        <w:t xml:space="preserve">Later, in 1985, the Legislature amended several statutes within the water code to authorize the OSE to deny an application if approval “would be contrary to the conservation of water within the state or detrimental to the public welfare of the state.” These provisions were added to multiple statutes, including the appropriation statute, § 72-⁠5-⁠7, and the transfer statute at issue in this case, § 72-⁠5-⁠23. The Legislature adopted the amendment to Section 72</w:t>
       </w:r>
       <w:r>
         <w:noBreakHyphen/>
@@ -6123,13 +5949,7 @@
         <w:t xml:space="preserve"> </w:t>
       </w:r>
       <w:r>
-        <w:t xml:space="preserve">¶¶ 39</w:t>
-      </w:r>
-      <w:r>
-        <w:noBreakHyphen/>
-      </w:r>
-      <w:r>
-        <w:t xml:space="preserve">40 (emphasis added). This Court declined to offer a “bright line test” for the conservation of water and observed that a bright-line approach might lead to “severe complications.”</w:t>
+        <w:t xml:space="preserve">¶¶ 39-⁠40 (emphasis added). This Court declined to offer a “bright line test” for the conservation of water and observed that a bright-line approach might lead to “severe complications.”</w:t>
       </w:r>
       <w:r>
         <w:t xml:space="preserve"> </w:t>
@@ -6794,25 +6614,13 @@
         <w:pStyle w:val="BodyText"/>
       </w:pPr>
       <w:r>
-        <w:t xml:space="preserve">Other states have recognized rights to maintain instream flows and have concluded that instream flows promote public welfare values. Oregon, for example, took an early step in listing instream flow as a public interest factor, and in 1929, Oregon adopted a statute to give due weight to “[c]onserving the highest use of the water for all purposes, including . . . public recreation, protection of commercial and game fishing and wildlife . . . or any other beneficial use to which water may be applied for which it may have a special value to the public.” Act of Feb. 28, 1929, ch. 245, Sec. 1, 1929 Or. Laws 252</w:t>
-      </w:r>
-      <w:r>
-        <w:noBreakHyphen/>
-      </w:r>
-      <w:r>
-        <w:t xml:space="preserve">3 (codified as amended at Or. Rev. Stat. Sec. 837.170(8)⁠(a) (2005) (emphasis added). Kansas lists five factors for public interest, including whether the proposed water use would deter and prejudice “[e]stablished minimum desirable streamflow requirements.” Kan. Stat. Ann. § 82a</w:t>
-      </w:r>
-      <w:r>
-        <w:noBreakHyphen/>
-      </w:r>
-      <w:r>
-        <w:t xml:space="preserve">711(b) (2004). Nebraska also includes instream flow considerations in its water rights application process by naming specific requirements for instream flow appropriations. Neb. Rev. Stat. Ann. § 46</w:t>
-      </w:r>
-      <w:r>
-        <w:noBreakHyphen/>
-      </w:r>
-      <w:r>
-        <w:t xml:space="preserve">2,116 (2025). The shift in western states to consider instream flows reflects an increasing consciousness and interest by the public to uphold the values in water beyond its economic development potential.</w:t>
+        <w:t xml:space="preserve">Other states have recognized rights to maintain instream flows and have concluded that instream flows promote public welfare values. Oregon, for example, took an early step in listing instream flow as a public interest factor, and in 1929, Oregon adopted a statute to give due weight to “[c]onserving the highest use of the water for all purposes, including . . . public recreation, protection of commercial and game fishing and wildlife . . . or any other beneficial use to which water may be applied for which it may have a special value to the public.” Act of Feb. 28, 1929, ch. 245, Sec. 1, 1929 Or. Laws 252</w:t>
+      </w:r>
+      <w:r>
+        <w:noBreakHyphen/>
+      </w:r>
+      <w:r>
+        <w:t xml:space="preserve">3 (codified as amended at Or. Rev. Stat. Sec. 837.170(8)⁠(a) (2005) (emphasis added). Kansas lists five factors for public interest, including whether the proposed water use would deter and prejudice “[e]stablished minimum desirable streamflow requirements.” Kan. Stat. Ann. § 82a-⁠711(b) (2004). Nebraska also includes instream flow considerations in its water rights application process by naming specific requirements for instream flow appropriations. Neb. Rev. Stat. Ann. § 46-⁠2,116 (2025). The shift in western states to consider instream flows reflects an increasing consciousness and interest by the public to uphold the values in water beyond its economic development potential.</w:t>
       </w:r>
     </w:p>
     <w:p>
@@ -7270,13 +7078,7 @@
         <w:noBreakHyphen/>
       </w:r>
       <w:r>
-        <w:t xml:space="preserve">030, ¶¶ 10</w:t>
-      </w:r>
-      <w:r>
-        <w:noBreakHyphen/>
-      </w:r>
-      <w:r>
-        <w:t xml:space="preserve">18, 107 N.M. 494, 760 P.2d 787. The Legislature’s addition of the public welfare criterion to Section 72</w:t>
+        <w:t xml:space="preserve">030, ¶¶ 10-⁠18, 107 N.M. 494, 760 P.2d 787. The Legislature’s addition of the public welfare criterion to Section 72</w:t>
       </w:r>
       <w:r>
         <w:noBreakHyphen/>
@@ -7635,13 +7437,7 @@
         <w:t xml:space="preserve"> </w:t>
       </w:r>
       <w:r>
-        <w:t xml:space="preserve">¶¶ 3</w:t>
-      </w:r>
-      <w:r>
-        <w:noBreakHyphen/>
-      </w:r>
-      <w:r>
-        <w:t xml:space="preserve">4. The Court of Appeals affirmed.</w:t>
+        <w:t xml:space="preserve">¶¶ 3-⁠4. The Court of Appeals affirmed.</w:t>
       </w:r>
       <w:r>
         <w:t xml:space="preserve"> </w:t>
@@ -9560,7 +9356,7 @@
         <w:t xml:space="preserve"> </w:t>
       </w:r>
       <w:r>
-        <w:t xml:space="preserve">Office of the New Mexico State Engineer, Middle Rio Grande Administrative Area Guidelines for Review of Water Right Applications (2000), http://​​www.​ose.​state.​nm.​us/​​doing–business/​​mrgbasin/​​crit9–13.​pdf.</w:t>
+        <w:t xml:space="preserve">Office of the New Mexico State Engineer, Middle Rio Grande Administrative Area Guidelines for Review of Water Right Applications (2000), http://​www.​ose.​state.​nm.​us/​doing–business/​mrgbasin/​crit9–13.​pdf.</w:t>
       </w:r>
     </w:p>
   </w:footnote>
@@ -9579,7 +9375,7 @@
         <w:t xml:space="preserve"> </w:t>
       </w:r>
       <w:r>
-        <w:t xml:space="preserve">New Mexico’s 50 Year Water Action Plan’s opening statement from Governor Michelle Lujan Grisham reads: “There are few places in the world where water holds such profound significance as here in New Mexico. The original inhabitants of the southwest have recognized the life-sustaining import of water for thousands of years. Today, it also holds immeasurable cultural, agricultural, ecological, economic, and recreational value.” Office of the Governor Michelle Lujan Grisham, 50 Year Water Action Plan, p. i (2024), available at https://​​www.​nm.​gov/​​wp-​content/​​uploads/​​2024/​​01/​​New-​Mexico</w:t>
+        <w:t xml:space="preserve">New Mexico’s 50 Year Water Action Plan’s opening statement from Governor Michelle Lujan Grisham reads: “There are few places in the world where water holds such profound significance as here in New Mexico. The original inhabitants of the southwest have recognized the life-sustaining import of water for thousands of years. Today, it also holds immeasurable cultural, agricultural, ecological, economic, and recreational value.” Office of the Governor Michelle Lujan Grisham, 50 Year Water Action Plan, p. i (2024), available at https://​www.​nm.​gov/​wp-​content/​uploads/​2024/​01/​New-​Mexico</w:t>
       </w:r>
       <w:r>
         <w:noBreakHyphen/>
@@ -10637,6 +10433,33 @@
       <w:ind w:left="2160" w:hanging="720"/>
     </w:pPr>
   </w:style>
+  <w:style w:type="paragraph" w:customStyle="1" w:styleId="XdQuoteList1">
+    <w:name w:val="Xd Quote List 1"/>
+    <w:basedOn w:val="Normal"/>
+    <w:qFormat/>
+    <w:pPr>
+      <w:spacing w:before="0" w:after="0" w:line="322" w:lineRule="exact"/>
+      <w:ind w:left="1440" w:right="720" w:hanging="720"/>
+    </w:pPr>
+  </w:style>
+  <w:style w:type="paragraph" w:customStyle="1" w:styleId="XdQuoteList2">
+    <w:name w:val="Xd Quote List 2"/>
+    <w:basedOn w:val="Normal"/>
+    <w:qFormat/>
+    <w:pPr>
+      <w:spacing w:before="0" w:after="0" w:line="322" w:lineRule="exact"/>
+      <w:ind w:left="2160" w:right="720" w:hanging="720"/>
+    </w:pPr>
+  </w:style>
+  <w:style w:type="paragraph" w:customStyle="1" w:styleId="XdQuoteList3">
+    <w:name w:val="Xd Quote List 3"/>
+    <w:basedOn w:val="Normal"/>
+    <w:qFormat/>
+    <w:pPr>
+      <w:spacing w:before="0" w:after="0" w:line="322" w:lineRule="exact"/>
+      <w:ind w:left="2880" w:right="720" w:hanging="720"/>
+    </w:pPr>
+  </w:style>
   <w:style w:type="paragraph" w:customStyle="1" w:styleId="XdQuoteOnly">
     <w:name w:val="XdQuoteOnly"/>
     <w:basedOn w:val="BodyText"/>

</xml_diff>